<commit_message>
building project image (docker)
</commit_message>
<xml_diff>
--- a/lr5.docx
+++ b/lr5.docx
@@ -39,7 +39,25 @@
           <w:szCs w:val="24"/>
           <w:lang w:eastAsia="ru-RU"/>
         </w:rPr>
-        <w:t>ФГАОУ ВО «УрФУ имени первого Президента России Б.Н. Ельцина»</w:t>
+        <w:t>ФГАОУ ВО «</w:t>
+      </w:r>
+      <w:proofErr w:type="spellStart"/>
+      <w:r>
+        <w:rPr>
+          <w:rFonts w:eastAsia="Times New Roman" w:cs="Times New Roman"/>
+          <w:szCs w:val="24"/>
+          <w:lang w:eastAsia="ru-RU"/>
+        </w:rPr>
+        <w:t>УрФУ</w:t>
+      </w:r>
+      <w:proofErr w:type="spellEnd"/>
+      <w:r>
+        <w:rPr>
+          <w:rFonts w:eastAsia="Times New Roman" w:cs="Times New Roman"/>
+          <w:szCs w:val="24"/>
+          <w:lang w:eastAsia="ru-RU"/>
+        </w:rPr>
+        <w:t xml:space="preserve"> имени первого Президента России Б.Н. Ельцина»</w:t>
       </w:r>
     </w:p>
     <w:p>
@@ -209,7 +227,29 @@
           <w:szCs w:val="32"/>
           <w:lang w:eastAsia="ru-RU"/>
         </w:rPr>
-        <w:t>Форматирование и линтинг проекта. Сборка образа проекта</w:t>
+        <w:t xml:space="preserve">Форматирование и </w:t>
+      </w:r>
+      <w:proofErr w:type="spellStart"/>
+      <w:r>
+        <w:rPr>
+          <w:rFonts w:eastAsia="Times New Roman" w:cs="Times New Roman"/>
+          <w:b/>
+          <w:sz w:val="32"/>
+          <w:szCs w:val="32"/>
+          <w:lang w:eastAsia="ru-RU"/>
+        </w:rPr>
+        <w:t>линтинг</w:t>
+      </w:r>
+      <w:proofErr w:type="spellEnd"/>
+      <w:r>
+        <w:rPr>
+          <w:rFonts w:eastAsia="Times New Roman" w:cs="Times New Roman"/>
+          <w:b/>
+          <w:sz w:val="32"/>
+          <w:szCs w:val="32"/>
+          <w:lang w:eastAsia="ru-RU"/>
+        </w:rPr>
+        <w:t xml:space="preserve"> проекта. Сборка образа проекта</w:t>
       </w:r>
     </w:p>
     <w:p>
@@ -704,8 +744,37 @@
         <w:t>Были установлены</w:t>
       </w:r>
       <w:r>
-        <w:t xml:space="preserve"> в проект pre-commit, pylint, black и isort</w:t>
-      </w:r>
+        <w:t xml:space="preserve"> в проект </w:t>
+      </w:r>
+      <w:proofErr w:type="spellStart"/>
+      <w:r>
+        <w:t>pre-commit</w:t>
+      </w:r>
+      <w:proofErr w:type="spellEnd"/>
+      <w:r>
+        <w:t xml:space="preserve">, </w:t>
+      </w:r>
+      <w:proofErr w:type="spellStart"/>
+      <w:r>
+        <w:t>pylint</w:t>
+      </w:r>
+      <w:proofErr w:type="spellEnd"/>
+      <w:r>
+        <w:t xml:space="preserve">, </w:t>
+      </w:r>
+      <w:proofErr w:type="spellStart"/>
+      <w:r>
+        <w:t>black</w:t>
+      </w:r>
+      <w:proofErr w:type="spellEnd"/>
+      <w:r>
+        <w:t xml:space="preserve"> и </w:t>
+      </w:r>
+      <w:proofErr w:type="spellStart"/>
+      <w:r>
+        <w:t>isort</w:t>
+      </w:r>
+      <w:proofErr w:type="spellEnd"/>
       <w:r>
         <w:t>. Настроен</w:t>
       </w:r>
@@ -719,8 +788,16 @@
         <w:rPr>
           <w:lang w:val="en-US"/>
         </w:rPr>
-        <w:t>pre-commit-config.yaml</w:t>
-      </w:r>
+        <w:t>pre-commit-</w:t>
+      </w:r>
+      <w:proofErr w:type="spellStart"/>
+      <w:r>
+        <w:rPr>
+          <w:lang w:val="en-US"/>
+        </w:rPr>
+        <w:t>config.yaml</w:t>
+      </w:r>
+      <w:proofErr w:type="spellEnd"/>
     </w:p>
     <w:p>
       <w:pPr>
@@ -837,8 +914,13 @@
         <w:t xml:space="preserve">Был создан и сконфигурирован файл </w:t>
       </w:r>
       <w:r>
-        <w:t>.pylintrc</w:t>
-      </w:r>
+        <w:t>.</w:t>
+      </w:r>
+      <w:proofErr w:type="spellStart"/>
+      <w:r>
+        <w:t>pylintrc</w:t>
+      </w:r>
+      <w:proofErr w:type="spellEnd"/>
       <w:r>
         <w:t>.</w:t>
       </w:r>
@@ -920,12 +1002,14 @@
       <w:r>
         <w:t xml:space="preserve">конфигурация. </w:t>
       </w:r>
+      <w:proofErr w:type="spellStart"/>
       <w:r>
         <w:rPr>
           <w:lang w:val="en-US"/>
         </w:rPr>
         <w:t>Pylintrc</w:t>
       </w:r>
+      <w:proofErr w:type="spellEnd"/>
     </w:p>
     <w:p>
       <w:r>
@@ -934,21 +1018,25 @@
       <w:r>
         <w:t xml:space="preserve"> </w:t>
       </w:r>
+      <w:proofErr w:type="spellStart"/>
       <w:r>
         <w:rPr>
           <w:lang w:val="en-US"/>
         </w:rPr>
         <w:t>pyproject</w:t>
       </w:r>
+      <w:proofErr w:type="spellEnd"/>
       <w:r>
         <w:t>.</w:t>
       </w:r>
+      <w:proofErr w:type="spellStart"/>
       <w:r>
         <w:rPr>
           <w:lang w:val="en-US"/>
         </w:rPr>
         <w:t>toml</w:t>
       </w:r>
+      <w:proofErr w:type="spellEnd"/>
       <w:r>
         <w:t xml:space="preserve"> </w:t>
       </w:r>
@@ -956,8 +1044,13 @@
         <w:t xml:space="preserve">были сконфигурированы </w:t>
       </w:r>
       <w:r>
-        <w:t>Black и isort</w:t>
-      </w:r>
+        <w:t xml:space="preserve">Black и </w:t>
+      </w:r>
+      <w:proofErr w:type="spellStart"/>
+      <w:r>
+        <w:t>isort</w:t>
+      </w:r>
+      <w:proofErr w:type="spellEnd"/>
       <w:r>
         <w:t>.</w:t>
       </w:r>
@@ -1011,36 +1104,42 @@
     <w:p>
       <w:pPr>
         <w:pStyle w:val="ab"/>
-        <w:rPr>
-          <w:lang w:val="en-US"/>
-        </w:rPr>
       </w:pPr>
       <w:r>
         <w:t>Рисунок</w:t>
       </w:r>
       <w:r>
-        <w:rPr>
-          <w:lang w:val="en-US"/>
-        </w:rPr>
         <w:t xml:space="preserve"> </w:t>
       </w:r>
       <w:r>
         <w:fldChar w:fldCharType="begin"/>
       </w:r>
       <w:r>
-        <w:rPr>
-          <w:lang w:val="en-US"/>
-        </w:rPr>
-        <w:instrText xml:space="preserve"> SEQ </w:instrText>
+        <w:instrText xml:space="preserve"> </w:instrText>
+      </w:r>
+      <w:r>
+        <w:rPr>
+          <w:lang w:val="en-US"/>
+        </w:rPr>
+        <w:instrText>SEQ</w:instrText>
+      </w:r>
+      <w:r>
+        <w:instrText xml:space="preserve"> </w:instrText>
       </w:r>
       <w:r>
         <w:instrText>Рисунок</w:instrText>
       </w:r>
       <w:r>
-        <w:rPr>
-          <w:lang w:val="en-US"/>
-        </w:rPr>
-        <w:instrText xml:space="preserve"> \* ARABIC </w:instrText>
+        <w:instrText xml:space="preserve"> \* </w:instrText>
+      </w:r>
+      <w:r>
+        <w:rPr>
+          <w:lang w:val="en-US"/>
+        </w:rPr>
+        <w:instrText>ARABIC</w:instrText>
+      </w:r>
+      <w:r>
+        <w:instrText xml:space="preserve"> </w:instrText>
       </w:r>
       <w:r>
         <w:fldChar w:fldCharType="separate"/>
@@ -1056,124 +1155,145 @@
         <w:fldChar w:fldCharType="end"/>
       </w:r>
       <w:r>
-        <w:rPr>
-          <w:lang w:val="en-US"/>
-        </w:rPr>
         <w:t xml:space="preserve"> - </w:t>
       </w:r>
       <w:r>
         <w:t>конфигурация</w:t>
       </w:r>
       <w:r>
-        <w:rPr>
-          <w:lang w:val="en-US"/>
-        </w:rPr>
         <w:t xml:space="preserve"> </w:t>
       </w:r>
       <w:r>
         <w:rPr>
           <w:lang w:val="en-US"/>
         </w:rPr>
-        <w:t xml:space="preserve">black </w:t>
+        <w:t>black</w:t>
+      </w:r>
+      <w:r>
+        <w:t xml:space="preserve"> </w:t>
       </w:r>
       <w:r>
         <w:t>и</w:t>
       </w:r>
       <w:r>
-        <w:rPr>
-          <w:lang w:val="en-US"/>
-        </w:rPr>
         <w:t xml:space="preserve"> </w:t>
       </w:r>
+      <w:proofErr w:type="spellStart"/>
       <w:r>
         <w:rPr>
           <w:lang w:val="en-US"/>
         </w:rPr>
         <w:t>isort</w:t>
       </w:r>
-    </w:p>
-    <w:p>
-      <w:pPr>
-        <w:rPr>
-          <w:lang w:val="en-US"/>
-        </w:rPr>
-      </w:pPr>
+      <w:proofErr w:type="spellEnd"/>
+    </w:p>
+    <w:p>
       <w:r>
         <w:t>Далее</w:t>
       </w:r>
       <w:r>
-        <w:rPr>
-          <w:lang w:val="en-US"/>
-        </w:rPr>
         <w:t xml:space="preserve"> </w:t>
       </w:r>
       <w:r>
         <w:t>была</w:t>
       </w:r>
       <w:r>
-        <w:rPr>
-          <w:lang w:val="en-US"/>
-        </w:rPr>
         <w:t xml:space="preserve"> </w:t>
       </w:r>
       <w:r>
         <w:t>запущена</w:t>
       </w:r>
       <w:r>
-        <w:rPr>
-          <w:lang w:val="en-US"/>
-        </w:rPr>
         <w:t xml:space="preserve"> </w:t>
       </w:r>
       <w:r>
         <w:t>команда</w:t>
       </w:r>
       <w:r>
-        <w:rPr>
-          <w:lang w:val="en-US"/>
-        </w:rPr>
         <w:t xml:space="preserve"> </w:t>
       </w:r>
       <w:r>
         <w:rPr>
           <w:lang w:val="en-US"/>
         </w:rPr>
-        <w:t>pre-commit install</w:t>
-      </w:r>
-      <w:r>
-        <w:rPr>
-          <w:lang w:val="en-US"/>
-        </w:rPr>
+        <w:t>pre</w:t>
+      </w:r>
+      <w:r>
+        <w:t>-</w:t>
+      </w:r>
+      <w:r>
+        <w:rPr>
+          <w:lang w:val="en-US"/>
+        </w:rPr>
+        <w:t>commit</w:t>
+      </w:r>
+      <w:r>
+        <w:t xml:space="preserve"> </w:t>
+      </w:r>
+      <w:r>
+        <w:rPr>
+          <w:lang w:val="en-US"/>
+        </w:rPr>
+        <w:t>install</w:t>
+      </w:r>
+      <w:r>
         <w:t xml:space="preserve">, </w:t>
       </w:r>
       <w:r>
         <w:rPr>
           <w:lang w:val="en-US"/>
         </w:rPr>
-        <w:t>pre-commit run --all-files</w:t>
-      </w:r>
-      <w:r>
-        <w:rPr>
-          <w:lang w:val="en-US"/>
-        </w:rPr>
+        <w:t>pre</w:t>
+      </w:r>
+      <w:r>
+        <w:t>-</w:t>
+      </w:r>
+      <w:r>
+        <w:rPr>
+          <w:lang w:val="en-US"/>
+        </w:rPr>
+        <w:t>commit</w:t>
+      </w:r>
+      <w:r>
         <w:t xml:space="preserve"> </w:t>
       </w:r>
       <w:r>
+        <w:rPr>
+          <w:lang w:val="en-US"/>
+        </w:rPr>
+        <w:t>run</w:t>
+      </w:r>
+      <w:r>
+        <w:t xml:space="preserve"> --</w:t>
+      </w:r>
+      <w:r>
+        <w:rPr>
+          <w:lang w:val="en-US"/>
+        </w:rPr>
+        <w:t>all</w:t>
+      </w:r>
+      <w:r>
+        <w:t>-</w:t>
+      </w:r>
+      <w:r>
+        <w:rPr>
+          <w:lang w:val="en-US"/>
+        </w:rPr>
+        <w:t>files</w:t>
+      </w:r>
+      <w:r>
+        <w:t xml:space="preserve"> </w:t>
+      </w:r>
+      <w:r>
         <w:t>для</w:t>
       </w:r>
       <w:r>
-        <w:rPr>
-          <w:lang w:val="en-US"/>
-        </w:rPr>
         <w:t xml:space="preserve"> </w:t>
       </w:r>
       <w:r>
         <w:t>проверки</w:t>
       </w:r>
       <w:r>
-        <w:rPr>
-          <w:lang w:val="en-US"/>
-        </w:rPr>
         <w:t xml:space="preserve"> </w:t>
       </w:r>
       <w:r>
@@ -1235,6 +1355,153 @@
         </w:rPr>
       </w:pPr>
       <w:r>
+        <w:t>Рисунок</w:t>
+      </w:r>
+      <w:r>
+        <w:rPr>
+          <w:lang w:val="en-US"/>
+        </w:rPr>
+        <w:t xml:space="preserve"> </w:t>
+      </w:r>
+      <w:r>
+        <w:fldChar w:fldCharType="begin"/>
+      </w:r>
+      <w:r>
+        <w:rPr>
+          <w:lang w:val="en-US"/>
+        </w:rPr>
+        <w:instrText xml:space="preserve"> SEQ </w:instrText>
+      </w:r>
+      <w:r>
+        <w:instrText>Рисунок</w:instrText>
+      </w:r>
+      <w:r>
+        <w:rPr>
+          <w:lang w:val="en-US"/>
+        </w:rPr>
+        <w:instrText xml:space="preserve"> \* ARABIC </w:instrText>
+      </w:r>
+      <w:r>
+        <w:fldChar w:fldCharType="separate"/>
+      </w:r>
+      <w:r>
+        <w:rPr>
+          <w:noProof/>
+          <w:lang w:val="en-US"/>
+        </w:rPr>
+        <w:t>4</w:t>
+      </w:r>
+      <w:r>
+        <w:fldChar w:fldCharType="end"/>
+      </w:r>
+      <w:r>
+        <w:rPr>
+          <w:lang w:val="en-US"/>
+        </w:rPr>
+        <w:t xml:space="preserve"> - </w:t>
+      </w:r>
+      <w:r>
+        <w:t>запуск</w:t>
+      </w:r>
+      <w:r>
+        <w:rPr>
+          <w:lang w:val="en-US"/>
+        </w:rPr>
+        <w:t xml:space="preserve"> </w:t>
+      </w:r>
+      <w:r>
+        <w:rPr>
+          <w:lang w:val="en-US"/>
+        </w:rPr>
+        <w:t>pre</w:t>
+      </w:r>
+      <w:r>
+        <w:rPr>
+          <w:lang w:val="en-US"/>
+        </w:rPr>
+        <w:t>-</w:t>
+      </w:r>
+      <w:r>
+        <w:rPr>
+          <w:lang w:val="en-US"/>
+        </w:rPr>
+        <w:t>commit</w:t>
+      </w:r>
+      <w:r>
+        <w:rPr>
+          <w:lang w:val="en-US"/>
+        </w:rPr>
+        <w:t xml:space="preserve"> </w:t>
+      </w:r>
+      <w:r>
+        <w:rPr>
+          <w:lang w:val="en-US"/>
+        </w:rPr>
+        <w:t>run</w:t>
+      </w:r>
+    </w:p>
+    <w:p>
+      <w:pPr>
+        <w:ind w:firstLine="0"/>
+      </w:pPr>
+      <w:r>
+        <w:rPr>
+          <w:lang w:val="en-US"/>
+        </w:rPr>
+        <w:tab/>
+      </w:r>
+      <w:r>
+        <w:t>Был сделан коммит.</w:t>
+      </w:r>
+    </w:p>
+    <w:p>
+      <w:pPr>
+        <w:keepNext/>
+        <w:ind w:firstLine="0"/>
+      </w:pPr>
+      <w:r>
+        <w:drawing>
+          <wp:inline distT="0" distB="0" distL="0" distR="0" wp14:anchorId="4FE5B7CA" wp14:editId="475F1AFD">
+            <wp:extent cx="5940425" cy="1750060"/>
+            <wp:effectExtent l="0" t="0" r="3175" b="2540"/>
+            <wp:docPr id="5" name="Рисунок 5"/>
+            <wp:cNvGraphicFramePr>
+              <a:graphicFrameLocks xmlns:a="http://schemas.openxmlformats.org/drawingml/2006/main" noChangeAspect="1"/>
+            </wp:cNvGraphicFramePr>
+            <a:graphic xmlns:a="http://schemas.openxmlformats.org/drawingml/2006/main">
+              <a:graphicData uri="http://schemas.openxmlformats.org/drawingml/2006/picture">
+                <pic:pic xmlns:pic="http://schemas.openxmlformats.org/drawingml/2006/picture">
+                  <pic:nvPicPr>
+                    <pic:cNvPr id="1" name=""/>
+                    <pic:cNvPicPr/>
+                  </pic:nvPicPr>
+                  <pic:blipFill>
+                    <a:blip r:embed="rId12"/>
+                    <a:stretch>
+                      <a:fillRect/>
+                    </a:stretch>
+                  </pic:blipFill>
+                  <pic:spPr>
+                    <a:xfrm>
+                      <a:off x="0" y="0"/>
+                      <a:ext cx="5940425" cy="1750060"/>
+                    </a:xfrm>
+                    <a:prstGeom prst="rect">
+                      <a:avLst/>
+                    </a:prstGeom>
+                  </pic:spPr>
+                </pic:pic>
+              </a:graphicData>
+            </a:graphic>
+          </wp:inline>
+        </w:drawing>
+      </w:r>
+    </w:p>
+    <w:p>
+      <w:pPr>
+        <w:pStyle w:val="ab"/>
+      </w:pPr>
+      <w:r>
         <w:t xml:space="preserve">Рисунок </w:t>
       </w:r>
       <w:fldSimple w:instr=" SEQ Рисунок \* ARABIC ">
@@ -1242,23 +1509,11 @@
           <w:rPr>
             <w:noProof/>
           </w:rPr>
-          <w:t>4</w:t>
+          <w:t>5</w:t>
         </w:r>
       </w:fldSimple>
       <w:r>
-        <w:rPr>
-          <w:lang w:val="en-US"/>
-        </w:rPr>
-        <w:t xml:space="preserve"> - </w:t>
-      </w:r>
-      <w:r>
-        <w:t xml:space="preserve">запуск </w:t>
-      </w:r>
-      <w:r>
-        <w:rPr>
-          <w:lang w:val="en-US"/>
-        </w:rPr>
-        <w:t>pre-commit run</w:t>
+        <w:t xml:space="preserve"> - коммит с проверками</w:t>
       </w:r>
     </w:p>
     <w:p>
@@ -1268,27 +1523,553 @@
           <w:lang w:val="en-US"/>
         </w:rPr>
       </w:pPr>
-      <w:r>
-        <w:rPr>
-          <w:lang w:val="en-US"/>
-        </w:rPr>
-        <w:t>Сборка образа проекта</w:t>
-      </w:r>
-    </w:p>
-    <w:p>
-      <w:pPr>
-        <w:rPr>
-          <w:lang w:val="en-US"/>
-        </w:rPr>
-      </w:pPr>
-    </w:p>
+      <w:proofErr w:type="spellStart"/>
+      <w:r>
+        <w:rPr>
+          <w:lang w:val="en-US"/>
+        </w:rPr>
+        <w:t>Сборка</w:t>
+      </w:r>
+      <w:proofErr w:type="spellEnd"/>
+      <w:r>
+        <w:rPr>
+          <w:lang w:val="en-US"/>
+        </w:rPr>
+        <w:t xml:space="preserve"> </w:t>
+      </w:r>
+      <w:proofErr w:type="spellStart"/>
+      <w:r>
+        <w:rPr>
+          <w:lang w:val="en-US"/>
+        </w:rPr>
+        <w:t>образа</w:t>
+      </w:r>
+      <w:proofErr w:type="spellEnd"/>
+      <w:r>
+        <w:rPr>
+          <w:lang w:val="en-US"/>
+        </w:rPr>
+        <w:t xml:space="preserve"> </w:t>
+      </w:r>
+      <w:proofErr w:type="spellStart"/>
+      <w:r>
+        <w:rPr>
+          <w:lang w:val="en-US"/>
+        </w:rPr>
+        <w:t>проекта</w:t>
+      </w:r>
+      <w:proofErr w:type="spellEnd"/>
+    </w:p>
+    <w:p>
+      <w:pPr>
+        <w:rPr>
+          <w:lang w:val="en-US"/>
+        </w:rPr>
+      </w:pPr>
+      <w:r>
+        <w:t xml:space="preserve">Был создан </w:t>
+      </w:r>
+      <w:proofErr w:type="spellStart"/>
+      <w:r>
+        <w:rPr>
+          <w:lang w:val="en-US"/>
+        </w:rPr>
+        <w:t>Dockerfile</w:t>
+      </w:r>
+      <w:proofErr w:type="spellEnd"/>
+      <w:r>
+        <w:rPr>
+          <w:lang w:val="en-US"/>
+        </w:rPr>
+        <w:t xml:space="preserve">, </w:t>
+      </w:r>
+      <w:proofErr w:type="spellStart"/>
+      <w:r>
+        <w:rPr>
+          <w:lang w:val="en-US"/>
+        </w:rPr>
+        <w:t>dockerignore</w:t>
+      </w:r>
+      <w:proofErr w:type="spellEnd"/>
+    </w:p>
+    <w:p>
+      <w:pPr>
+        <w:keepNext/>
+        <w:ind w:firstLine="0"/>
+        <w:jc w:val="center"/>
+      </w:pPr>
+      <w:r>
+        <w:rPr>
+          <w:lang w:val="en-US"/>
+        </w:rPr>
+        <w:drawing>
+          <wp:inline distT="0" distB="0" distL="0" distR="0" wp14:anchorId="00F0EAB3" wp14:editId="356891B8">
+            <wp:extent cx="4124901" cy="2648320"/>
+            <wp:effectExtent l="0" t="0" r="9525" b="0"/>
+            <wp:docPr id="6" name="Рисунок 6"/>
+            <wp:cNvGraphicFramePr>
+              <a:graphicFrameLocks xmlns:a="http://schemas.openxmlformats.org/drawingml/2006/main" noChangeAspect="1"/>
+            </wp:cNvGraphicFramePr>
+            <a:graphic xmlns:a="http://schemas.openxmlformats.org/drawingml/2006/main">
+              <a:graphicData uri="http://schemas.openxmlformats.org/drawingml/2006/picture">
+                <pic:pic xmlns:pic="http://schemas.openxmlformats.org/drawingml/2006/picture">
+                  <pic:nvPicPr>
+                    <pic:cNvPr id="1" name=""/>
+                    <pic:cNvPicPr/>
+                  </pic:nvPicPr>
+                  <pic:blipFill>
+                    <a:blip r:embed="rId13"/>
+                    <a:stretch>
+                      <a:fillRect/>
+                    </a:stretch>
+                  </pic:blipFill>
+                  <pic:spPr>
+                    <a:xfrm>
+                      <a:off x="0" y="0"/>
+                      <a:ext cx="4124901" cy="2648320"/>
+                    </a:xfrm>
+                    <a:prstGeom prst="rect">
+                      <a:avLst/>
+                    </a:prstGeom>
+                  </pic:spPr>
+                </pic:pic>
+              </a:graphicData>
+            </a:graphic>
+          </wp:inline>
+        </w:drawing>
+      </w:r>
+    </w:p>
+    <w:p>
+      <w:pPr>
+        <w:pStyle w:val="ab"/>
+        <w:rPr>
+          <w:lang w:val="en-US"/>
+        </w:rPr>
+      </w:pPr>
+      <w:r>
+        <w:t xml:space="preserve">Рисунок </w:t>
+      </w:r>
+      <w:fldSimple w:instr=" SEQ Рисунок \* ARABIC ">
+        <w:r>
+          <w:rPr>
+            <w:noProof/>
+          </w:rPr>
+          <w:t>6</w:t>
+        </w:r>
+      </w:fldSimple>
+      <w:r>
+        <w:rPr>
+          <w:lang w:val="en-US"/>
+        </w:rPr>
+        <w:t xml:space="preserve"> – </w:t>
+      </w:r>
+      <w:proofErr w:type="spellStart"/>
+      <w:r>
+        <w:rPr>
+          <w:lang w:val="en-US"/>
+        </w:rPr>
+        <w:t>dockerfile</w:t>
+      </w:r>
+      <w:proofErr w:type="spellEnd"/>
+    </w:p>
+    <w:p>
+      <w:pPr>
+        <w:keepNext/>
+        <w:ind w:firstLine="0"/>
+        <w:jc w:val="center"/>
+      </w:pPr>
+      <w:r>
+        <w:rPr>
+          <w:lang w:val="en-US"/>
+        </w:rPr>
+        <w:lastRenderedPageBreak/>
+        <w:drawing>
+          <wp:inline distT="0" distB="0" distL="0" distR="0" wp14:anchorId="001E8FCD" wp14:editId="2F7F4BB1">
+            <wp:extent cx="3048425" cy="6535062"/>
+            <wp:effectExtent l="0" t="0" r="0" b="0"/>
+            <wp:docPr id="7" name="Рисунок 7"/>
+            <wp:cNvGraphicFramePr>
+              <a:graphicFrameLocks xmlns:a="http://schemas.openxmlformats.org/drawingml/2006/main" noChangeAspect="1"/>
+            </wp:cNvGraphicFramePr>
+            <a:graphic xmlns:a="http://schemas.openxmlformats.org/drawingml/2006/main">
+              <a:graphicData uri="http://schemas.openxmlformats.org/drawingml/2006/picture">
+                <pic:pic xmlns:pic="http://schemas.openxmlformats.org/drawingml/2006/picture">
+                  <pic:nvPicPr>
+                    <pic:cNvPr id="1" name=""/>
+                    <pic:cNvPicPr/>
+                  </pic:nvPicPr>
+                  <pic:blipFill>
+                    <a:blip r:embed="rId14"/>
+                    <a:stretch>
+                      <a:fillRect/>
+                    </a:stretch>
+                  </pic:blipFill>
+                  <pic:spPr>
+                    <a:xfrm>
+                      <a:off x="0" y="0"/>
+                      <a:ext cx="3048425" cy="6535062"/>
+                    </a:xfrm>
+                    <a:prstGeom prst="rect">
+                      <a:avLst/>
+                    </a:prstGeom>
+                  </pic:spPr>
+                </pic:pic>
+              </a:graphicData>
+            </a:graphic>
+          </wp:inline>
+        </w:drawing>
+      </w:r>
+    </w:p>
+    <w:p>
+      <w:pPr>
+        <w:pStyle w:val="ab"/>
+      </w:pPr>
+      <w:r>
+        <w:t xml:space="preserve">Рисунок </w:t>
+      </w:r>
+      <w:fldSimple w:instr=" SEQ Рисунок \* ARABIC ">
+        <w:r>
+          <w:rPr>
+            <w:noProof/>
+          </w:rPr>
+          <w:t>7</w:t>
+        </w:r>
+      </w:fldSimple>
+      <w:r>
+        <w:t xml:space="preserve"> </w:t>
+      </w:r>
+      <w:r>
+        <w:t>–</w:t>
+      </w:r>
+      <w:r>
+        <w:t xml:space="preserve"> </w:t>
+      </w:r>
+      <w:proofErr w:type="spellStart"/>
+      <w:r>
+        <w:rPr>
+          <w:lang w:val="en-US"/>
+        </w:rPr>
+        <w:t>dockerignore</w:t>
+      </w:r>
+      <w:proofErr w:type="spellEnd"/>
+    </w:p>
+    <w:p>
+      <w:r>
+        <w:t xml:space="preserve">Был создан </w:t>
+      </w:r>
+      <w:proofErr w:type="spellStart"/>
+      <w:r>
+        <w:rPr>
+          <w:lang w:val="en-US"/>
+        </w:rPr>
+        <w:t>entrypoint</w:t>
+      </w:r>
+      <w:proofErr w:type="spellEnd"/>
+      <w:r>
+        <w:t>.</w:t>
+      </w:r>
+      <w:proofErr w:type="spellStart"/>
+      <w:r>
+        <w:rPr>
+          <w:lang w:val="en-US"/>
+        </w:rPr>
+        <w:t>sh</w:t>
+      </w:r>
+      <w:proofErr w:type="spellEnd"/>
+    </w:p>
+    <w:p>
+      <w:pPr>
+        <w:keepNext/>
+        <w:ind w:firstLine="0"/>
+        <w:jc w:val="center"/>
+        <w:rPr>
+          <w:lang w:val="en-US"/>
+        </w:rPr>
+      </w:pPr>
+      <w:r>
+        <w:lastRenderedPageBreak/>
+        <w:drawing>
+          <wp:inline distT="0" distB="0" distL="0" distR="0" wp14:anchorId="7570FB1F" wp14:editId="0A5EC4E2">
+            <wp:extent cx="3115110" cy="2200582"/>
+            <wp:effectExtent l="0" t="0" r="9525" b="9525"/>
+            <wp:docPr id="9" name="Рисунок 9"/>
+            <wp:cNvGraphicFramePr>
+              <a:graphicFrameLocks xmlns:a="http://schemas.openxmlformats.org/drawingml/2006/main" noChangeAspect="1"/>
+            </wp:cNvGraphicFramePr>
+            <a:graphic xmlns:a="http://schemas.openxmlformats.org/drawingml/2006/main">
+              <a:graphicData uri="http://schemas.openxmlformats.org/drawingml/2006/picture">
+                <pic:pic xmlns:pic="http://schemas.openxmlformats.org/drawingml/2006/picture">
+                  <pic:nvPicPr>
+                    <pic:cNvPr id="1" name=""/>
+                    <pic:cNvPicPr/>
+                  </pic:nvPicPr>
+                  <pic:blipFill>
+                    <a:blip r:embed="rId15"/>
+                    <a:stretch>
+                      <a:fillRect/>
+                    </a:stretch>
+                  </pic:blipFill>
+                  <pic:spPr>
+                    <a:xfrm>
+                      <a:off x="0" y="0"/>
+                      <a:ext cx="3115110" cy="2200582"/>
+                    </a:xfrm>
+                    <a:prstGeom prst="rect">
+                      <a:avLst/>
+                    </a:prstGeom>
+                  </pic:spPr>
+                </pic:pic>
+              </a:graphicData>
+            </a:graphic>
+          </wp:inline>
+        </w:drawing>
+      </w:r>
+    </w:p>
+    <w:p>
+      <w:pPr>
+        <w:pStyle w:val="ab"/>
+        <w:rPr>
+          <w:lang w:val="en-US"/>
+        </w:rPr>
+      </w:pPr>
+      <w:r>
+        <w:t xml:space="preserve">Рисунок </w:t>
+      </w:r>
+      <w:fldSimple w:instr=" SEQ Рисунок \* ARABIC ">
+        <w:r>
+          <w:rPr>
+            <w:noProof/>
+          </w:rPr>
+          <w:t>8</w:t>
+        </w:r>
+      </w:fldSimple>
+      <w:r>
+        <w:rPr>
+          <w:lang w:val="en-US"/>
+        </w:rPr>
+        <w:t xml:space="preserve"> - entrypoint.sh</w:t>
+      </w:r>
+    </w:p>
+    <w:p>
+      <w:r>
+        <w:t>Далее был запущен контейнер и проверена его работоспособность.</w:t>
+      </w:r>
+    </w:p>
+    <w:p>
+      <w:pPr>
+        <w:keepNext/>
+        <w:ind w:firstLine="0"/>
+      </w:pPr>
+      <w:r>
+        <w:drawing>
+          <wp:inline distT="0" distB="0" distL="0" distR="0" wp14:anchorId="42BFF5FE" wp14:editId="650D5C75">
+            <wp:extent cx="5940425" cy="666115"/>
+            <wp:effectExtent l="0" t="0" r="3175" b="635"/>
+            <wp:docPr id="12" name="Рисунок 12"/>
+            <wp:cNvGraphicFramePr>
+              <a:graphicFrameLocks xmlns:a="http://schemas.openxmlformats.org/drawingml/2006/main" noChangeAspect="1"/>
+            </wp:cNvGraphicFramePr>
+            <a:graphic xmlns:a="http://schemas.openxmlformats.org/drawingml/2006/main">
+              <a:graphicData uri="http://schemas.openxmlformats.org/drawingml/2006/picture">
+                <pic:pic xmlns:pic="http://schemas.openxmlformats.org/drawingml/2006/picture">
+                  <pic:nvPicPr>
+                    <pic:cNvPr id="1" name=""/>
+                    <pic:cNvPicPr/>
+                  </pic:nvPicPr>
+                  <pic:blipFill>
+                    <a:blip r:embed="rId16"/>
+                    <a:stretch>
+                      <a:fillRect/>
+                    </a:stretch>
+                  </pic:blipFill>
+                  <pic:spPr>
+                    <a:xfrm>
+                      <a:off x="0" y="0"/>
+                      <a:ext cx="5940425" cy="666115"/>
+                    </a:xfrm>
+                    <a:prstGeom prst="rect">
+                      <a:avLst/>
+                    </a:prstGeom>
+                  </pic:spPr>
+                </pic:pic>
+              </a:graphicData>
+            </a:graphic>
+          </wp:inline>
+        </w:drawing>
+      </w:r>
+    </w:p>
+    <w:p>
+      <w:pPr>
+        <w:pStyle w:val="ab"/>
+      </w:pPr>
+      <w:r>
+        <w:t xml:space="preserve">Рисунок </w:t>
+      </w:r>
+      <w:fldSimple w:instr=" SEQ Рисунок \* ARABIC ">
+        <w:r>
+          <w:rPr>
+            <w:noProof/>
+          </w:rPr>
+          <w:t>9</w:t>
+        </w:r>
+      </w:fldSimple>
+      <w:r>
+        <w:t xml:space="preserve"> - запущенные </w:t>
+      </w:r>
+      <w:r>
+        <w:rPr>
+          <w:lang w:val="en-US"/>
+        </w:rPr>
+        <w:t>docker-</w:t>
+      </w:r>
+      <w:r>
+        <w:t>контейнеры</w:t>
+      </w:r>
+    </w:p>
+    <w:p>
+      <w:pPr>
+        <w:keepNext/>
+        <w:ind w:firstLine="0"/>
+      </w:pPr>
+      <w:r>
+        <w:drawing>
+          <wp:inline distT="0" distB="0" distL="0" distR="0" wp14:anchorId="50FDBE49" wp14:editId="409D0833">
+            <wp:extent cx="5940425" cy="1435735"/>
+            <wp:effectExtent l="0" t="0" r="3175" b="0"/>
+            <wp:docPr id="10" name="Рисунок 10"/>
+            <wp:cNvGraphicFramePr>
+              <a:graphicFrameLocks xmlns:a="http://schemas.openxmlformats.org/drawingml/2006/main" noChangeAspect="1"/>
+            </wp:cNvGraphicFramePr>
+            <a:graphic xmlns:a="http://schemas.openxmlformats.org/drawingml/2006/main">
+              <a:graphicData uri="http://schemas.openxmlformats.org/drawingml/2006/picture">
+                <pic:pic xmlns:pic="http://schemas.openxmlformats.org/drawingml/2006/picture">
+                  <pic:nvPicPr>
+                    <pic:cNvPr id="1" name=""/>
+                    <pic:cNvPicPr/>
+                  </pic:nvPicPr>
+                  <pic:blipFill>
+                    <a:blip r:embed="rId17"/>
+                    <a:stretch>
+                      <a:fillRect/>
+                    </a:stretch>
+                  </pic:blipFill>
+                  <pic:spPr>
+                    <a:xfrm>
+                      <a:off x="0" y="0"/>
+                      <a:ext cx="5940425" cy="1435735"/>
+                    </a:xfrm>
+                    <a:prstGeom prst="rect">
+                      <a:avLst/>
+                    </a:prstGeom>
+                  </pic:spPr>
+                </pic:pic>
+              </a:graphicData>
+            </a:graphic>
+          </wp:inline>
+        </w:drawing>
+      </w:r>
+    </w:p>
+    <w:p>
+      <w:pPr>
+        <w:pStyle w:val="ab"/>
+      </w:pPr>
+      <w:r>
+        <w:t xml:space="preserve">Рисунок </w:t>
+      </w:r>
+      <w:fldSimple w:instr=" SEQ Рисунок \* ARABIC ">
+        <w:r>
+          <w:rPr>
+            <w:noProof/>
+          </w:rPr>
+          <w:t>10</w:t>
+        </w:r>
+      </w:fldSimple>
+      <w:r>
+        <w:t xml:space="preserve"> - результат запроса пользователей со стороны </w:t>
+      </w:r>
+      <w:r>
+        <w:rPr>
+          <w:lang w:val="en-US"/>
+        </w:rPr>
+        <w:t>docker</w:t>
+      </w:r>
+    </w:p>
+    <w:p>
+      <w:pPr>
+        <w:keepNext/>
+        <w:ind w:firstLine="0"/>
+      </w:pPr>
+      <w:r>
+        <w:drawing>
+          <wp:inline distT="0" distB="0" distL="0" distR="0" wp14:anchorId="7E644C5F" wp14:editId="549BE5ED">
+            <wp:extent cx="5940425" cy="425450"/>
+            <wp:effectExtent l="0" t="0" r="3175" b="0"/>
+            <wp:docPr id="14" name="Рисунок 14"/>
+            <wp:cNvGraphicFramePr>
+              <a:graphicFrameLocks xmlns:a="http://schemas.openxmlformats.org/drawingml/2006/main" noChangeAspect="1"/>
+            </wp:cNvGraphicFramePr>
+            <a:graphic xmlns:a="http://schemas.openxmlformats.org/drawingml/2006/main">
+              <a:graphicData uri="http://schemas.openxmlformats.org/drawingml/2006/picture">
+                <pic:pic xmlns:pic="http://schemas.openxmlformats.org/drawingml/2006/picture">
+                  <pic:nvPicPr>
+                    <pic:cNvPr id="1" name=""/>
+                    <pic:cNvPicPr/>
+                  </pic:nvPicPr>
+                  <pic:blipFill>
+                    <a:blip r:embed="rId18"/>
+                    <a:stretch>
+                      <a:fillRect/>
+                    </a:stretch>
+                  </pic:blipFill>
+                  <pic:spPr>
+                    <a:xfrm>
+                      <a:off x="0" y="0"/>
+                      <a:ext cx="5940425" cy="425450"/>
+                    </a:xfrm>
+                    <a:prstGeom prst="rect">
+                      <a:avLst/>
+                    </a:prstGeom>
+                  </pic:spPr>
+                </pic:pic>
+              </a:graphicData>
+            </a:graphic>
+          </wp:inline>
+        </w:drawing>
+      </w:r>
+    </w:p>
+    <w:p>
+      <w:pPr>
+        <w:pStyle w:val="ab"/>
+      </w:pPr>
+      <w:r>
+        <w:t xml:space="preserve">Рисунок </w:t>
+      </w:r>
+      <w:fldSimple w:instr=" SEQ Рисунок \* ARABIC ">
+        <w:r>
+          <w:rPr>
+            <w:noProof/>
+          </w:rPr>
+          <w:t>11</w:t>
+        </w:r>
+      </w:fldSimple>
+      <w:r>
+        <w:t xml:space="preserve"> - результат </w:t>
+      </w:r>
+      <w:r>
+        <w:t xml:space="preserve">создания пользователя и </w:t>
+      </w:r>
+      <w:r>
+        <w:t>запроса пользователей со стороны клиента</w:t>
+      </w:r>
+    </w:p>
+    <w:p/>
     <w:sectPr>
-      <w:headerReference w:type="even" r:id="rId12"/>
-      <w:headerReference w:type="default" r:id="rId13"/>
-      <w:footerReference w:type="even" r:id="rId14"/>
-      <w:footerReference w:type="default" r:id="rId15"/>
-      <w:headerReference w:type="first" r:id="rId16"/>
-      <w:footerReference w:type="first" r:id="rId17"/>
+      <w:headerReference w:type="even" r:id="rId19"/>
+      <w:headerReference w:type="default" r:id="rId20"/>
+      <w:footerReference w:type="even" r:id="rId21"/>
+      <w:footerReference w:type="default" r:id="rId22"/>
+      <w:headerReference w:type="first" r:id="rId23"/>
+      <w:footerReference w:type="first" r:id="rId24"/>
       <w:pgSz w:w="11906" w:h="16838"/>
       <w:pgMar w:top="1134" w:right="850" w:bottom="1134" w:left="1701" w:header="708" w:footer="708" w:gutter="0"/>
       <w:cols w:space="708"/>

</xml_diff>

<commit_message>
lab_5 finished; readme_lr5 added
</commit_message>
<xml_diff>
--- a/lr5.docx
+++ b/lr5.docx
@@ -791,6 +791,7 @@
         <w:t>pre-commit-</w:t>
       </w:r>
       <w:proofErr w:type="spellStart"/>
+      <w:proofErr w:type="gramStart"/>
       <w:r>
         <w:rPr>
           <w:lang w:val="en-US"/>
@@ -798,6 +799,7 @@
         <w:t>config.yaml</w:t>
       </w:r>
       <w:proofErr w:type="spellEnd"/>
+      <w:proofErr w:type="gramEnd"/>
     </w:p>
     <w:p>
       <w:pPr>
@@ -851,76 +853,126 @@
         <w:pStyle w:val="ab"/>
         <w:rPr>
           <w:noProof/>
+        </w:rPr>
+      </w:pPr>
+      <w:r>
+        <w:t>Рисунок</w:t>
+      </w:r>
+      <w:r>
+        <w:t xml:space="preserve"> </w:t>
+      </w:r>
+      <w:r>
+        <w:fldChar w:fldCharType="begin"/>
+      </w:r>
+      <w:r>
+        <w:instrText xml:space="preserve"> </w:instrText>
+      </w:r>
+      <w:r>
+        <w:rPr>
           <w:lang w:val="en-US"/>
         </w:rPr>
-      </w:pPr>
-      <w:r>
-        <w:t>Рисунок</w:t>
+        <w:instrText>SEQ</w:instrText>
+      </w:r>
+      <w:r>
+        <w:instrText xml:space="preserve"> </w:instrText>
+      </w:r>
+      <w:r>
+        <w:instrText>Рисунок</w:instrText>
+      </w:r>
+      <w:r>
+        <w:instrText xml:space="preserve"> \* </w:instrText>
       </w:r>
       <w:r>
         <w:rPr>
           <w:lang w:val="en-US"/>
         </w:rPr>
-        <w:t xml:space="preserve"> </w:t>
-      </w:r>
-      <w:r>
-        <w:fldChar w:fldCharType="begin"/>
-      </w:r>
-      <w:r>
-        <w:rPr>
-          <w:lang w:val="en-US"/>
-        </w:rPr>
-        <w:instrText xml:space="preserve"> SEQ </w:instrText>
-      </w:r>
-      <w:r>
-        <w:instrText>Рисунок</w:instrText>
-      </w:r>
-      <w:r>
-        <w:rPr>
-          <w:lang w:val="en-US"/>
-        </w:rPr>
-        <w:instrText xml:space="preserve"> \* ARABIC </w:instrText>
+        <w:instrText>ARABIC</w:instrText>
+      </w:r>
+      <w:r>
+        <w:instrText xml:space="preserve"> </w:instrText>
       </w:r>
       <w:r>
         <w:fldChar w:fldCharType="separate"/>
+      </w:r>
+      <w:r>
+        <w:rPr>
+          <w:noProof/>
+        </w:rPr>
+        <w:t>1</w:t>
+      </w:r>
+      <w:r>
+        <w:fldChar w:fldCharType="end"/>
+      </w:r>
+      <w:r>
+        <w:rPr>
+          <w:noProof/>
+        </w:rPr>
+        <w:t xml:space="preserve"> - </w:t>
       </w:r>
       <w:r>
         <w:rPr>
           <w:noProof/>
           <w:lang w:val="en-US"/>
         </w:rPr>
-        <w:t>1</w:t>
-      </w:r>
-      <w:r>
-        <w:fldChar w:fldCharType="end"/>
+        <w:t>pre</w:t>
+      </w:r>
+      <w:r>
+        <w:rPr>
+          <w:noProof/>
+        </w:rPr>
+        <w:t>-</w:t>
       </w:r>
       <w:r>
         <w:rPr>
           <w:noProof/>
           <w:lang w:val="en-US"/>
         </w:rPr>
-        <w:t xml:space="preserve"> - </w:t>
+        <w:t>commit</w:t>
+      </w:r>
+      <w:r>
+        <w:rPr>
+          <w:noProof/>
+        </w:rPr>
+        <w:t>-</w:t>
       </w:r>
       <w:r>
         <w:rPr>
           <w:noProof/>
           <w:lang w:val="en-US"/>
         </w:rPr>
-        <w:t>pre-commit-config.yaml</w:t>
-      </w:r>
-    </w:p>
-    <w:p>
-      <w:r>
-        <w:t xml:space="preserve">Был создан и сконфигурирован файл </w:t>
-      </w:r>
-      <w:r>
+        <w:t>config</w:t>
+      </w:r>
+      <w:r>
+        <w:rPr>
+          <w:noProof/>
+        </w:rPr>
         <w:t>.</w:t>
       </w:r>
+      <w:r>
+        <w:rPr>
+          <w:noProof/>
+          <w:lang w:val="en-US"/>
+        </w:rPr>
+        <w:t>yaml</w:t>
+      </w:r>
+    </w:p>
+    <w:p>
+      <w:r>
+        <w:t xml:space="preserve">Был создан и сконфигурирован </w:t>
+      </w:r>
+      <w:proofErr w:type="gramStart"/>
+      <w:r>
+        <w:t xml:space="preserve">файл </w:t>
+      </w:r>
+      <w:r>
+        <w:t>.</w:t>
+      </w:r>
       <w:proofErr w:type="spellStart"/>
       <w:r>
         <w:t>pylintrc</w:t>
       </w:r>
       <w:proofErr w:type="spellEnd"/>
+      <w:proofErr w:type="gramEnd"/>
       <w:r>
         <w:t>.</w:t>
       </w:r>
@@ -975,68 +1027,77 @@
     <w:p>
       <w:pPr>
         <w:pStyle w:val="ab"/>
+      </w:pPr>
+      <w:r>
+        <w:t xml:space="preserve">Рисунок </w:t>
+      </w:r>
+      <w:r>
+        <w:fldChar w:fldCharType="begin"/>
+      </w:r>
+      <w:r>
+        <w:instrText xml:space="preserve"> SEQ Рисунок \* ARABIC </w:instrText>
+      </w:r>
+      <w:r>
+        <w:fldChar w:fldCharType="separate"/>
+      </w:r>
+      <w:r>
+        <w:rPr>
+          <w:noProof/>
+        </w:rPr>
+        <w:t>2</w:t>
+      </w:r>
+      <w:r>
+        <w:rPr>
+          <w:noProof/>
+        </w:rPr>
+        <w:fldChar w:fldCharType="end"/>
+      </w:r>
+      <w:r>
+        <w:t xml:space="preserve"> -</w:t>
+      </w:r>
+      <w:r>
+        <w:t xml:space="preserve"> </w:t>
+      </w:r>
+      <w:r>
+        <w:t xml:space="preserve">конфигурация. </w:t>
+      </w:r>
+      <w:proofErr w:type="spellStart"/>
+      <w:r>
         <w:rPr>
           <w:lang w:val="en-US"/>
         </w:rPr>
-      </w:pPr>
-      <w:r>
-        <w:t xml:space="preserve">Рисунок </w:t>
-      </w:r>
-      <w:fldSimple w:instr=" SEQ Рисунок \* ARABIC ">
-        <w:r>
-          <w:rPr>
-            <w:noProof/>
-          </w:rPr>
-          <w:t>2</w:t>
-        </w:r>
-      </w:fldSimple>
-      <w:r>
-        <w:t xml:space="preserve"> -</w:t>
-      </w:r>
+        <w:t>Pylintrc</w:t>
+      </w:r>
+      <w:proofErr w:type="spellEnd"/>
+    </w:p>
+    <w:p>
+      <w:r>
+        <w:t>В</w:t>
+      </w:r>
+      <w:r>
+        <w:t xml:space="preserve"> </w:t>
+      </w:r>
+      <w:proofErr w:type="spellStart"/>
+      <w:proofErr w:type="gramStart"/>
       <w:r>
         <w:rPr>
           <w:lang w:val="en-US"/>
         </w:rPr>
-        <w:t xml:space="preserve"> </w:t>
-      </w:r>
-      <w:r>
-        <w:t xml:space="preserve">конфигурация. </w:t>
+        <w:t>pyproject</w:t>
+      </w:r>
+      <w:proofErr w:type="spellEnd"/>
+      <w:r>
+        <w:t>.</w:t>
       </w:r>
       <w:proofErr w:type="spellStart"/>
       <w:r>
         <w:rPr>
           <w:lang w:val="en-US"/>
         </w:rPr>
-        <w:t>Pylintrc</w:t>
+        <w:t>toml</w:t>
       </w:r>
       <w:proofErr w:type="spellEnd"/>
-    </w:p>
-    <w:p>
-      <w:r>
-        <w:t>В</w:t>
-      </w:r>
-      <w:r>
-        <w:t xml:space="preserve"> </w:t>
-      </w:r>
-      <w:proofErr w:type="spellStart"/>
-      <w:r>
-        <w:rPr>
-          <w:lang w:val="en-US"/>
-        </w:rPr>
-        <w:t>pyproject</w:t>
-      </w:r>
-      <w:proofErr w:type="spellEnd"/>
-      <w:r>
-        <w:t>.</w:t>
-      </w:r>
-      <w:proofErr w:type="spellStart"/>
-      <w:r>
-        <w:rPr>
-          <w:lang w:val="en-US"/>
-        </w:rPr>
-        <w:t>toml</w:t>
-      </w:r>
-      <w:proofErr w:type="spellEnd"/>
+      <w:proofErr w:type="gramEnd"/>
       <w:r>
         <w:t xml:space="preserve"> </w:t>
       </w:r>
@@ -1147,7 +1208,6 @@
       <w:r>
         <w:rPr>
           <w:noProof/>
-          <w:lang w:val="en-US"/>
         </w:rPr>
         <w:t>3</w:t>
       </w:r>
@@ -1350,93 +1410,86 @@
     <w:p>
       <w:pPr>
         <w:pStyle w:val="ab"/>
+      </w:pPr>
+      <w:r>
+        <w:t>Рисунок</w:t>
+      </w:r>
+      <w:r>
+        <w:t xml:space="preserve"> </w:t>
+      </w:r>
+      <w:r>
+        <w:fldChar w:fldCharType="begin"/>
+      </w:r>
+      <w:r>
+        <w:instrText xml:space="preserve"> </w:instrText>
+      </w:r>
+      <w:r>
         <w:rPr>
           <w:lang w:val="en-US"/>
         </w:rPr>
-      </w:pPr>
-      <w:r>
-        <w:t>Рисунок</w:t>
+        <w:instrText>SEQ</w:instrText>
+      </w:r>
+      <w:r>
+        <w:instrText xml:space="preserve"> </w:instrText>
+      </w:r>
+      <w:r>
+        <w:instrText>Рисунок</w:instrText>
+      </w:r>
+      <w:r>
+        <w:instrText xml:space="preserve"> \* </w:instrText>
       </w:r>
       <w:r>
         <w:rPr>
           <w:lang w:val="en-US"/>
         </w:rPr>
+        <w:instrText>ARABIC</w:instrText>
+      </w:r>
+      <w:r>
+        <w:instrText xml:space="preserve"> </w:instrText>
+      </w:r>
+      <w:r>
+        <w:fldChar w:fldCharType="separate"/>
+      </w:r>
+      <w:r>
+        <w:rPr>
+          <w:noProof/>
+        </w:rPr>
+        <w:t>4</w:t>
+      </w:r>
+      <w:r>
+        <w:fldChar w:fldCharType="end"/>
+      </w:r>
+      <w:r>
+        <w:t xml:space="preserve"> - </w:t>
+      </w:r>
+      <w:r>
+        <w:t>запуск</w:t>
+      </w:r>
+      <w:r>
         <w:t xml:space="preserve"> </w:t>
       </w:r>
       <w:r>
-        <w:fldChar w:fldCharType="begin"/>
-      </w:r>
-      <w:r>
         <w:rPr>
           <w:lang w:val="en-US"/>
         </w:rPr>
-        <w:instrText xml:space="preserve"> SEQ </w:instrText>
-      </w:r>
-      <w:r>
-        <w:instrText>Рисунок</w:instrText>
+        <w:t>pre</w:t>
+      </w:r>
+      <w:r>
+        <w:t>-</w:t>
       </w:r>
       <w:r>
         <w:rPr>
           <w:lang w:val="en-US"/>
         </w:rPr>
-        <w:instrText xml:space="preserve"> \* ARABIC </w:instrText>
-      </w:r>
-      <w:r>
-        <w:fldChar w:fldCharType="separate"/>
-      </w:r>
-      <w:r>
-        <w:rPr>
-          <w:noProof/>
+        <w:t>commit</w:t>
+      </w:r>
+      <w:r>
+        <w:t xml:space="preserve"> </w:t>
+      </w:r>
+      <w:r>
+        <w:rPr>
           <w:lang w:val="en-US"/>
         </w:rPr>
-        <w:t>4</w:t>
-      </w:r>
-      <w:r>
-        <w:fldChar w:fldCharType="end"/>
-      </w:r>
-      <w:r>
-        <w:rPr>
-          <w:lang w:val="en-US"/>
-        </w:rPr>
-        <w:t xml:space="preserve"> - </w:t>
-      </w:r>
-      <w:r>
-        <w:t>запуск</w:t>
-      </w:r>
-      <w:r>
-        <w:rPr>
-          <w:lang w:val="en-US"/>
-        </w:rPr>
-        <w:t xml:space="preserve"> </w:t>
-      </w:r>
-      <w:r>
-        <w:rPr>
-          <w:lang w:val="en-US"/>
-        </w:rPr>
-        <w:t>pre</w:t>
-      </w:r>
-      <w:r>
-        <w:rPr>
-          <w:lang w:val="en-US"/>
-        </w:rPr>
-        <w:t>-</w:t>
-      </w:r>
-      <w:r>
-        <w:rPr>
-          <w:lang w:val="en-US"/>
-        </w:rPr>
-        <w:t>commit</w:t>
-      </w:r>
-      <w:r>
-        <w:rPr>
-          <w:lang w:val="en-US"/>
-        </w:rPr>
-        <w:t xml:space="preserve"> </w:t>
-      </w:r>
-      <w:r>
-        <w:rPr>
-          <w:lang w:val="en-US"/>
-        </w:rPr>
         <w:t>run</w:t>
       </w:r>
     </w:p>
@@ -1445,9 +1498,6 @@
         <w:ind w:firstLine="0"/>
       </w:pPr>
       <w:r>
-        <w:rPr>
-          <w:lang w:val="en-US"/>
-        </w:rPr>
         <w:tab/>
       </w:r>
       <w:r>
@@ -1460,6 +1510,9 @@
         <w:ind w:firstLine="0"/>
       </w:pPr>
       <w:r>
+        <w:rPr>
+          <w:noProof/>
+        </w:rPr>
         <w:drawing>
           <wp:inline distT="0" distB="0" distL="0" distR="0" wp14:anchorId="4FE5B7CA" wp14:editId="475F1AFD">
             <wp:extent cx="5940425" cy="1750060"/>
@@ -1504,14 +1557,27 @@
       <w:r>
         <w:t xml:space="preserve">Рисунок </w:t>
       </w:r>
-      <w:fldSimple w:instr=" SEQ Рисунок \* ARABIC ">
-        <w:r>
-          <w:rPr>
-            <w:noProof/>
-          </w:rPr>
-          <w:t>5</w:t>
-        </w:r>
-      </w:fldSimple>
+      <w:r>
+        <w:fldChar w:fldCharType="begin"/>
+      </w:r>
+      <w:r>
+        <w:instrText xml:space="preserve"> SEQ Рисунок \* ARABIC </w:instrText>
+      </w:r>
+      <w:r>
+        <w:fldChar w:fldCharType="separate"/>
+      </w:r>
+      <w:r>
+        <w:rPr>
+          <w:noProof/>
+        </w:rPr>
+        <w:t>5</w:t>
+      </w:r>
+      <w:r>
+        <w:rPr>
+          <w:noProof/>
+        </w:rPr>
+        <w:fldChar w:fldCharType="end"/>
+      </w:r>
       <w:r>
         <w:t xml:space="preserve"> - коммит с проверками</w:t>
       </w:r>
@@ -1600,6 +1666,7 @@
       </w:pPr>
       <w:r>
         <w:rPr>
+          <w:noProof/>
           <w:lang w:val="en-US"/>
         </w:rPr>
         <w:drawing>
@@ -1649,14 +1716,27 @@
       <w:r>
         <w:t xml:space="preserve">Рисунок </w:t>
       </w:r>
-      <w:fldSimple w:instr=" SEQ Рисунок \* ARABIC ">
-        <w:r>
-          <w:rPr>
-            <w:noProof/>
-          </w:rPr>
-          <w:t>6</w:t>
-        </w:r>
-      </w:fldSimple>
+      <w:r>
+        <w:fldChar w:fldCharType="begin"/>
+      </w:r>
+      <w:r>
+        <w:instrText xml:space="preserve"> SEQ Рисунок \* ARABIC </w:instrText>
+      </w:r>
+      <w:r>
+        <w:fldChar w:fldCharType="separate"/>
+      </w:r>
+      <w:r>
+        <w:rPr>
+          <w:noProof/>
+        </w:rPr>
+        <w:t>6</w:t>
+      </w:r>
+      <w:r>
+        <w:rPr>
+          <w:noProof/>
+        </w:rPr>
+        <w:fldChar w:fldCharType="end"/>
+      </w:r>
       <w:r>
         <w:rPr>
           <w:lang w:val="en-US"/>
@@ -1680,6 +1760,7 @@
       </w:pPr>
       <w:r>
         <w:rPr>
+          <w:noProof/>
           <w:lang w:val="en-US"/>
         </w:rPr>
         <w:lastRenderedPageBreak/>
@@ -1727,14 +1808,27 @@
       <w:r>
         <w:t xml:space="preserve">Рисунок </w:t>
       </w:r>
-      <w:fldSimple w:instr=" SEQ Рисунок \* ARABIC ">
-        <w:r>
-          <w:rPr>
-            <w:noProof/>
-          </w:rPr>
-          <w:t>7</w:t>
-        </w:r>
-      </w:fldSimple>
+      <w:r>
+        <w:fldChar w:fldCharType="begin"/>
+      </w:r>
+      <w:r>
+        <w:instrText xml:space="preserve"> SEQ Рисунок \* ARABIC </w:instrText>
+      </w:r>
+      <w:r>
+        <w:fldChar w:fldCharType="separate"/>
+      </w:r>
+      <w:r>
+        <w:rPr>
+          <w:noProof/>
+        </w:rPr>
+        <w:t>7</w:t>
+      </w:r>
+      <w:r>
+        <w:rPr>
+          <w:noProof/>
+        </w:rPr>
+        <w:fldChar w:fldCharType="end"/>
+      </w:r>
       <w:r>
         <w:t xml:space="preserve"> </w:t>
       </w:r>
@@ -1787,6 +1881,9 @@
         </w:rPr>
       </w:pPr>
       <w:r>
+        <w:rPr>
+          <w:noProof/>
+        </w:rPr>
         <w:lastRenderedPageBreak/>
         <w:drawing>
           <wp:inline distT="0" distB="0" distL="0" distR="0" wp14:anchorId="7570FB1F" wp14:editId="0A5EC4E2">
@@ -1828,27 +1925,53 @@
     <w:p>
       <w:pPr>
         <w:pStyle w:val="ab"/>
+      </w:pPr>
+      <w:r>
+        <w:t xml:space="preserve">Рисунок </w:t>
+      </w:r>
+      <w:r>
+        <w:fldChar w:fldCharType="begin"/>
+      </w:r>
+      <w:r>
+        <w:instrText xml:space="preserve"> SEQ Рисунок \* ARABIC </w:instrText>
+      </w:r>
+      <w:r>
+        <w:fldChar w:fldCharType="separate"/>
+      </w:r>
+      <w:r>
+        <w:rPr>
+          <w:noProof/>
+        </w:rPr>
+        <w:t>8</w:t>
+      </w:r>
+      <w:r>
+        <w:rPr>
+          <w:noProof/>
+        </w:rPr>
+        <w:fldChar w:fldCharType="end"/>
+      </w:r>
+      <w:r>
+        <w:t xml:space="preserve"> - </w:t>
+      </w:r>
+      <w:proofErr w:type="spellStart"/>
+      <w:r>
         <w:rPr>
           <w:lang w:val="en-US"/>
         </w:rPr>
-      </w:pPr>
-      <w:r>
-        <w:t xml:space="preserve">Рисунок </w:t>
-      </w:r>
-      <w:fldSimple w:instr=" SEQ Рисунок \* ARABIC ">
-        <w:r>
-          <w:rPr>
-            <w:noProof/>
-          </w:rPr>
-          <w:t>8</w:t>
-        </w:r>
-      </w:fldSimple>
+        <w:t>entrypoint</w:t>
+      </w:r>
+      <w:proofErr w:type="spellEnd"/>
+      <w:r>
+        <w:t>.</w:t>
+      </w:r>
+      <w:proofErr w:type="spellStart"/>
       <w:r>
         <w:rPr>
           <w:lang w:val="en-US"/>
         </w:rPr>
-        <w:t xml:space="preserve"> - entrypoint.sh</w:t>
-      </w:r>
+        <w:t>sh</w:t>
+      </w:r>
+      <w:proofErr w:type="spellEnd"/>
     </w:p>
     <w:p>
       <w:r>
@@ -1861,6 +1984,9 @@
         <w:ind w:firstLine="0"/>
       </w:pPr>
       <w:r>
+        <w:rPr>
+          <w:noProof/>
+        </w:rPr>
         <w:drawing>
           <wp:inline distT="0" distB="0" distL="0" distR="0" wp14:anchorId="42BFF5FE" wp14:editId="650D5C75">
             <wp:extent cx="5940425" cy="666115"/>
@@ -1905,14 +2031,27 @@
       <w:r>
         <w:t xml:space="preserve">Рисунок </w:t>
       </w:r>
-      <w:fldSimple w:instr=" SEQ Рисунок \* ARABIC ">
-        <w:r>
-          <w:rPr>
-            <w:noProof/>
-          </w:rPr>
-          <w:t>9</w:t>
-        </w:r>
-      </w:fldSimple>
+      <w:r>
+        <w:fldChar w:fldCharType="begin"/>
+      </w:r>
+      <w:r>
+        <w:instrText xml:space="preserve"> SEQ Рисунок \* ARABIC </w:instrText>
+      </w:r>
+      <w:r>
+        <w:fldChar w:fldCharType="separate"/>
+      </w:r>
+      <w:r>
+        <w:rPr>
+          <w:noProof/>
+        </w:rPr>
+        <w:t>9</w:t>
+      </w:r>
+      <w:r>
+        <w:rPr>
+          <w:noProof/>
+        </w:rPr>
+        <w:fldChar w:fldCharType="end"/>
+      </w:r>
       <w:r>
         <w:t xml:space="preserve"> - запущенные </w:t>
       </w:r>
@@ -1932,6 +2071,9 @@
         <w:ind w:firstLine="0"/>
       </w:pPr>
       <w:r>
+        <w:rPr>
+          <w:noProof/>
+        </w:rPr>
         <w:drawing>
           <wp:inline distT="0" distB="0" distL="0" distR="0" wp14:anchorId="50FDBE49" wp14:editId="409D0833">
             <wp:extent cx="5940425" cy="1435735"/>
@@ -1976,14 +2118,27 @@
       <w:r>
         <w:t xml:space="preserve">Рисунок </w:t>
       </w:r>
-      <w:fldSimple w:instr=" SEQ Рисунок \* ARABIC ">
-        <w:r>
-          <w:rPr>
-            <w:noProof/>
-          </w:rPr>
-          <w:t>10</w:t>
-        </w:r>
-      </w:fldSimple>
+      <w:r>
+        <w:fldChar w:fldCharType="begin"/>
+      </w:r>
+      <w:r>
+        <w:instrText xml:space="preserve"> SEQ Рисунок \* ARABIC </w:instrText>
+      </w:r>
+      <w:r>
+        <w:fldChar w:fldCharType="separate"/>
+      </w:r>
+      <w:r>
+        <w:rPr>
+          <w:noProof/>
+        </w:rPr>
+        <w:t>10</w:t>
+      </w:r>
+      <w:r>
+        <w:rPr>
+          <w:noProof/>
+        </w:rPr>
+        <w:fldChar w:fldCharType="end"/>
+      </w:r>
       <w:r>
         <w:t xml:space="preserve"> - результат запроса пользователей со стороны </w:t>
       </w:r>
@@ -2000,6 +2155,9 @@
         <w:ind w:firstLine="0"/>
       </w:pPr>
       <w:r>
+        <w:rPr>
+          <w:noProof/>
+        </w:rPr>
         <w:drawing>
           <wp:inline distT="0" distB="0" distL="0" distR="0" wp14:anchorId="7E644C5F" wp14:editId="549BE5ED">
             <wp:extent cx="5940425" cy="425450"/>
@@ -2044,14 +2202,27 @@
       <w:r>
         <w:t xml:space="preserve">Рисунок </w:t>
       </w:r>
-      <w:fldSimple w:instr=" SEQ Рисунок \* ARABIC ">
-        <w:r>
-          <w:rPr>
-            <w:noProof/>
-          </w:rPr>
-          <w:t>11</w:t>
-        </w:r>
-      </w:fldSimple>
+      <w:r>
+        <w:fldChar w:fldCharType="begin"/>
+      </w:r>
+      <w:r>
+        <w:instrText xml:space="preserve"> SEQ Рисунок \* ARABIC </w:instrText>
+      </w:r>
+      <w:r>
+        <w:fldChar w:fldCharType="separate"/>
+      </w:r>
+      <w:r>
+        <w:rPr>
+          <w:noProof/>
+        </w:rPr>
+        <w:t>11</w:t>
+      </w:r>
+      <w:r>
+        <w:rPr>
+          <w:noProof/>
+        </w:rPr>
+        <w:fldChar w:fldCharType="end"/>
+      </w:r>
       <w:r>
         <w:t xml:space="preserve"> - результат </w:t>
       </w:r>
@@ -2062,7 +2233,266 @@
         <w:t>запроса пользователей со стороны клиента</w:t>
       </w:r>
     </w:p>
-    <w:p/>
+    <w:p>
+      <w:pPr>
+        <w:pStyle w:val="1"/>
+      </w:pPr>
+      <w:r>
+        <w:t>Ответы на вопросы</w:t>
+      </w:r>
+    </w:p>
+    <w:p>
+      <w:pPr>
+        <w:pStyle w:val="ac"/>
+        <w:numPr>
+          <w:ilvl w:val="0"/>
+          <w:numId w:val="23"/>
+        </w:numPr>
+      </w:pPr>
+      <w:proofErr w:type="spellStart"/>
+      <w:r>
+        <w:t>Docker</w:t>
+      </w:r>
+      <w:proofErr w:type="spellEnd"/>
+      <w:r>
+        <w:t>-контейнер — это легковесная изолированная среда для запуска приложения вместе со всеми его зависимостями</w:t>
+      </w:r>
+      <w:r>
+        <w:t>.</w:t>
+      </w:r>
+    </w:p>
+    <w:p>
+      <w:pPr>
+        <w:pStyle w:val="ac"/>
+        <w:ind w:left="1069" w:firstLine="0"/>
+      </w:pPr>
+      <w:r>
+        <w:t>Виртуальная машина (VM) эмулирует целую аппаратную платформу и запускает свою копию операционной системы вместе с приложениями, что требует гораздо больше ресурсов</w:t>
+      </w:r>
+      <w:r>
+        <w:t>.</w:t>
+      </w:r>
+    </w:p>
+    <w:p>
+      <w:pPr>
+        <w:pStyle w:val="ac"/>
+        <w:numPr>
+          <w:ilvl w:val="0"/>
+          <w:numId w:val="23"/>
+        </w:numPr>
+      </w:pPr>
+      <w:proofErr w:type="spellStart"/>
+      <w:r>
+        <w:lastRenderedPageBreak/>
+        <w:t>Docker</w:t>
+      </w:r>
+      <w:proofErr w:type="spellEnd"/>
+      <w:r>
+        <w:t xml:space="preserve">-слои — это части образа, создаваемые для каждой инструкции в </w:t>
+      </w:r>
+      <w:proofErr w:type="spellStart"/>
+      <w:r>
+        <w:t>Dockerfile</w:t>
+      </w:r>
+      <w:proofErr w:type="spellEnd"/>
+      <w:r>
+        <w:t xml:space="preserve">. Если слой не изменился со времени предыдущей сборки, </w:t>
+      </w:r>
+      <w:proofErr w:type="spellStart"/>
+      <w:r>
+        <w:t>Docker</w:t>
+      </w:r>
+      <w:proofErr w:type="spellEnd"/>
+      <w:r>
+        <w:t xml:space="preserve"> использует </w:t>
+      </w:r>
+      <w:proofErr w:type="spellStart"/>
+      <w:r>
+        <w:t>кеш</w:t>
+      </w:r>
+      <w:proofErr w:type="spellEnd"/>
+      <w:r>
+        <w:t xml:space="preserve"> — повторно использует уже существующий слой вместо повторной сборки.​ Это ускоряет сборку образов и экономит ресурсы</w:t>
+      </w:r>
+      <w:r>
+        <w:t>.</w:t>
+      </w:r>
+    </w:p>
+    <w:p>
+      <w:pPr>
+        <w:pStyle w:val="ac"/>
+        <w:numPr>
+          <w:ilvl w:val="0"/>
+          <w:numId w:val="23"/>
+        </w:numPr>
+      </w:pPr>
+      <w:r>
+        <w:t xml:space="preserve">Инструкция </w:t>
+      </w:r>
+      <w:proofErr w:type="spellStart"/>
+      <w:r>
+        <w:t>depends_on</w:t>
+      </w:r>
+      <w:proofErr w:type="spellEnd"/>
+      <w:r>
+        <w:t xml:space="preserve"> в </w:t>
+      </w:r>
+      <w:proofErr w:type="spellStart"/>
+      <w:r>
+        <w:t>docker-compose</w:t>
+      </w:r>
+      <w:proofErr w:type="spellEnd"/>
+      <w:r>
+        <w:t xml:space="preserve"> указывает на то, что один сервис зависит от другого. </w:t>
+      </w:r>
+      <w:proofErr w:type="spellStart"/>
+      <w:r>
+        <w:t>Docker-compose</w:t>
+      </w:r>
+      <w:proofErr w:type="spellEnd"/>
+      <w:r>
+        <w:t xml:space="preserve"> сначала запускает сервисы, от которых зависит основной сервис, а затем сам основной сервис</w:t>
+      </w:r>
+      <w:r>
+        <w:t>.</w:t>
+      </w:r>
+    </w:p>
+    <w:p>
+      <w:pPr>
+        <w:pStyle w:val="ac"/>
+        <w:numPr>
+          <w:ilvl w:val="0"/>
+          <w:numId w:val="23"/>
+        </w:numPr>
+      </w:pPr>
+      <w:r>
+        <w:t>Миграции должны запускаться уже после запуска контейнера, потому что во время сборки образа базы данных ещё нет в рабочем состоянии</w:t>
+      </w:r>
+      <w:r>
+        <w:t>.</w:t>
+      </w:r>
+    </w:p>
+    <w:p>
+      <w:pPr>
+        <w:pStyle w:val="ac"/>
+        <w:numPr>
+          <w:ilvl w:val="0"/>
+          <w:numId w:val="23"/>
+        </w:numPr>
+      </w:pPr>
+      <w:r>
+        <w:t>Если команда миграции завершится ошибкой внутри entrypoint.sh, то обычно сам контейнер тоже завершит свою работу с ошибкой</w:t>
+      </w:r>
+    </w:p>
+    <w:p>
+      <w:pPr>
+        <w:pStyle w:val="ac"/>
+        <w:numPr>
+          <w:ilvl w:val="0"/>
+          <w:numId w:val="23"/>
+        </w:numPr>
+      </w:pPr>
+      <w:r>
+        <w:t>Линтер (flake8) анализирует код на наличие потенциальных ошибок, нарушений стиля, некорректных импортов и т.д., но не меняет исходники автоматически.</w:t>
+      </w:r>
+    </w:p>
+    <w:p>
+      <w:pPr>
+        <w:pStyle w:val="ac"/>
+        <w:ind w:left="1069" w:firstLine="0"/>
+      </w:pPr>
+      <w:r>
+        <w:t>Форматер (</w:t>
+      </w:r>
+      <w:proofErr w:type="spellStart"/>
+      <w:r>
+        <w:t>black</w:t>
+      </w:r>
+      <w:proofErr w:type="spellEnd"/>
+      <w:r>
+        <w:t>) — автоматически изменяет код, чтобы тот соответствовал определённому стандарту оформления (отступы, пробелы, кавычки и пр.).</w:t>
+      </w:r>
+    </w:p>
+    <w:p>
+      <w:pPr>
+        <w:pStyle w:val="ac"/>
+        <w:numPr>
+          <w:ilvl w:val="0"/>
+          <w:numId w:val="23"/>
+        </w:numPr>
+      </w:pPr>
+      <w:proofErr w:type="spellStart"/>
+      <w:r>
+        <w:t>Pre-commit</w:t>
+      </w:r>
+      <w:proofErr w:type="spellEnd"/>
+      <w:r>
+        <w:t xml:space="preserve"> хуки автоматически запускают проверки (линтеры, форматеры, тесты и др.) каждый раз перед коммитом. Это позволяет обнаруживать и устранять ошибки до попадания кода в репозиторий</w:t>
+      </w:r>
+    </w:p>
+    <w:p>
+      <w:pPr>
+        <w:pStyle w:val="1"/>
+      </w:pPr>
+      <w:r>
+        <w:t>Выводы</w:t>
+      </w:r>
+    </w:p>
+    <w:p>
+      <w:r>
+        <w:t>В ходе выполнения работы была успешно реализована интеграция</w:t>
+      </w:r>
+      <w:r>
+        <w:t xml:space="preserve"> инструментов автопроверки </w:t>
+      </w:r>
+      <w:proofErr w:type="gramStart"/>
+      <w:r>
+        <w:t>коммитов</w:t>
+      </w:r>
+      <w:proofErr w:type="gramEnd"/>
+      <w:r>
+        <w:t xml:space="preserve"> а также использование докера</w:t>
+      </w:r>
+      <w:r>
+        <w:t xml:space="preserve">. Применение инструментов </w:t>
+      </w:r>
+      <w:proofErr w:type="spellStart"/>
+      <w:r>
+        <w:t>pre-commit</w:t>
+      </w:r>
+      <w:proofErr w:type="spellEnd"/>
+      <w:r>
+        <w:t xml:space="preserve">, линтеров и </w:t>
+      </w:r>
+      <w:proofErr w:type="spellStart"/>
+      <w:r>
+        <w:t>форматтеров</w:t>
+      </w:r>
+      <w:proofErr w:type="spellEnd"/>
+      <w:r>
+        <w:t xml:space="preserve"> позволило организовать проверку и стандартизацию кода уже на этапе коммита. Контейнеризация с помощью </w:t>
+      </w:r>
+      <w:proofErr w:type="spellStart"/>
+      <w:r>
+        <w:t>Docker</w:t>
+      </w:r>
+      <w:proofErr w:type="spellEnd"/>
+      <w:r>
+        <w:t xml:space="preserve"> упростила формирование </w:t>
+      </w:r>
+      <w:r>
+        <w:lastRenderedPageBreak/>
+        <w:t xml:space="preserve">воспроизводимого окружения для приложения, а </w:t>
+      </w:r>
+      <w:proofErr w:type="spellStart"/>
+      <w:r>
+        <w:t>docker-compose</w:t>
+      </w:r>
+      <w:proofErr w:type="spellEnd"/>
+      <w:r>
+        <w:t xml:space="preserve"> обеспечил удобство управления зависимостями и сервисами.</w:t>
+      </w:r>
+    </w:p>
     <w:sectPr>
       <w:headerReference w:type="even" r:id="rId19"/>
       <w:headerReference w:type="default" r:id="rId20"/>
@@ -4298,6 +4728,95 @@
     </w:lvl>
   </w:abstractNum>
   <w:abstractNum w:abstractNumId="20" w15:restartNumberingAfterBreak="0">
+    <w:nsid w:val="6E450984"/>
+    <w:multiLevelType w:val="hybridMultilevel"/>
+    <w:tmpl w:val="3188795C"/>
+    <w:lvl w:ilvl="0" w:tplc="E048D126">
+      <w:start w:val="1"/>
+      <w:numFmt w:val="decimal"/>
+      <w:lvlText w:val="%1."/>
+      <w:lvlJc w:val="left"/>
+      <w:pPr>
+        <w:ind w:left="1069" w:hanging="360"/>
+      </w:pPr>
+      <w:rPr>
+        <w:rFonts w:hint="default"/>
+      </w:rPr>
+    </w:lvl>
+    <w:lvl w:ilvl="1" w:tplc="04190019" w:tentative="1">
+      <w:start w:val="1"/>
+      <w:numFmt w:val="lowerLetter"/>
+      <w:lvlText w:val="%2."/>
+      <w:lvlJc w:val="left"/>
+      <w:pPr>
+        <w:ind w:left="1789" w:hanging="360"/>
+      </w:pPr>
+    </w:lvl>
+    <w:lvl w:ilvl="2" w:tplc="0419001B" w:tentative="1">
+      <w:start w:val="1"/>
+      <w:numFmt w:val="lowerRoman"/>
+      <w:lvlText w:val="%3."/>
+      <w:lvlJc w:val="right"/>
+      <w:pPr>
+        <w:ind w:left="2509" w:hanging="180"/>
+      </w:pPr>
+    </w:lvl>
+    <w:lvl w:ilvl="3" w:tplc="0419000F" w:tentative="1">
+      <w:start w:val="1"/>
+      <w:numFmt w:val="decimal"/>
+      <w:lvlText w:val="%4."/>
+      <w:lvlJc w:val="left"/>
+      <w:pPr>
+        <w:ind w:left="3229" w:hanging="360"/>
+      </w:pPr>
+    </w:lvl>
+    <w:lvl w:ilvl="4" w:tplc="04190019" w:tentative="1">
+      <w:start w:val="1"/>
+      <w:numFmt w:val="lowerLetter"/>
+      <w:lvlText w:val="%5."/>
+      <w:lvlJc w:val="left"/>
+      <w:pPr>
+        <w:ind w:left="3949" w:hanging="360"/>
+      </w:pPr>
+    </w:lvl>
+    <w:lvl w:ilvl="5" w:tplc="0419001B" w:tentative="1">
+      <w:start w:val="1"/>
+      <w:numFmt w:val="lowerRoman"/>
+      <w:lvlText w:val="%6."/>
+      <w:lvlJc w:val="right"/>
+      <w:pPr>
+        <w:ind w:left="4669" w:hanging="180"/>
+      </w:pPr>
+    </w:lvl>
+    <w:lvl w:ilvl="6" w:tplc="0419000F" w:tentative="1">
+      <w:start w:val="1"/>
+      <w:numFmt w:val="decimal"/>
+      <w:lvlText w:val="%7."/>
+      <w:lvlJc w:val="left"/>
+      <w:pPr>
+        <w:ind w:left="5389" w:hanging="360"/>
+      </w:pPr>
+    </w:lvl>
+    <w:lvl w:ilvl="7" w:tplc="04190019" w:tentative="1">
+      <w:start w:val="1"/>
+      <w:numFmt w:val="lowerLetter"/>
+      <w:lvlText w:val="%8."/>
+      <w:lvlJc w:val="left"/>
+      <w:pPr>
+        <w:ind w:left="6109" w:hanging="360"/>
+      </w:pPr>
+    </w:lvl>
+    <w:lvl w:ilvl="8" w:tplc="0419001B" w:tentative="1">
+      <w:start w:val="1"/>
+      <w:numFmt w:val="lowerRoman"/>
+      <w:lvlText w:val="%9."/>
+      <w:lvlJc w:val="right"/>
+      <w:pPr>
+        <w:ind w:left="6829" w:hanging="180"/>
+      </w:pPr>
+    </w:lvl>
+  </w:abstractNum>
+  <w:abstractNum w:abstractNumId="21" w15:restartNumberingAfterBreak="0">
     <w:nsid w:val="74605A8D"/>
     <w:multiLevelType w:val="multilevel"/>
     <w:tmpl w:val="04190025"/>
@@ -4392,7 +4911,7 @@
       </w:pPr>
     </w:lvl>
   </w:abstractNum>
-  <w:abstractNum w:abstractNumId="21" w15:restartNumberingAfterBreak="0">
+  <w:abstractNum w:abstractNumId="22" w15:restartNumberingAfterBreak="0">
     <w:nsid w:val="79992872"/>
     <w:multiLevelType w:val="multilevel"/>
     <w:tmpl w:val="198C7DC2"/>
@@ -4482,13 +5001,13 @@
     </w:lvl>
   </w:abstractNum>
   <w:num w:numId="1">
-    <w:abstractNumId w:val="20"/>
+    <w:abstractNumId w:val="21"/>
   </w:num>
   <w:num w:numId="2">
     <w:abstractNumId w:val="5"/>
   </w:num>
   <w:num w:numId="3">
-    <w:abstractNumId w:val="21"/>
+    <w:abstractNumId w:val="22"/>
   </w:num>
   <w:num w:numId="4">
     <w:abstractNumId w:val="7"/>
@@ -4549,6 +5068,9 @@
   </w:num>
   <w:num w:numId="22">
     <w:abstractNumId w:val="0"/>
+  </w:num>
+  <w:num w:numId="23">
+    <w:abstractNumId w:val="20"/>
   </w:num>
 </w:numbering>
 </file>

</xml_diff>